<commit_message>
add labs and reports
</commit_message>
<xml_diff>
--- a/iot/LR1_iot_Nedoviziy.docx
+++ b/iot/LR1_iot_Nedoviziy.docx
@@ -332,7 +332,16 @@
                 <w:sz w:val="28"/>
                 <w:szCs w:val="24"/>
               </w:rPr>
-              <w:t>Студент гр. 2491</w:t>
+              <w:t>Студент гр. 2</w:t>
+            </w:r>
+            <w:r>
+              <w:rPr>
+                <w:rFonts w:ascii="Times New Roman" w:hAnsi="Times New Roman"/>
+                <w:bCs/>
+                <w:sz w:val="28"/>
+                <w:szCs w:val="24"/>
+              </w:rPr>
+              <w:t>387</w:t>
             </w:r>
           </w:p>
         </w:tc>
@@ -521,7 +530,15 @@
           <w:sz w:val="28"/>
           <w:szCs w:val="24"/>
         </w:rPr>
-        <w:t>2025</w:t>
+        <w:t>202</w:t>
+      </w:r>
+      <w:r>
+        <w:rPr>
+          <w:rFonts w:ascii="Times New Roman" w:hAnsi="Times New Roman"/>
+          <w:sz w:val="28"/>
+          <w:szCs w:val="24"/>
+        </w:rPr>
+        <w:t>6</w:t>
       </w:r>
     </w:p>
     <w:p>
@@ -1311,7 +1328,16 @@
           <w:color w:val="0F1115"/>
           <w:sz w:val="24"/>
         </w:rPr>
-        <w:t xml:space="preserve">Если освещенность &lt; </w:t>
+        <w:t xml:space="preserve">Если освещенность </w:t>
+      </w:r>
+      <w:proofErr w:type="gramStart"/>
+      <w:r>
+        <w:rPr>
+          <w:rFonts w:ascii="Times New Roman" w:hAnsi="Times New Roman"/>
+          <w:color w:val="0F1115"/>
+          <w:sz w:val="24"/>
+        </w:rPr>
+        <w:t xml:space="preserve">&lt; </w:t>
       </w:r>
       <w:r>
         <w:rPr>
@@ -1327,7 +1353,16 @@
           <w:color w:val="0F1115"/>
           <w:sz w:val="24"/>
         </w:rPr>
-        <w:t>0% – все светодиоды включены</w:t>
+        <w:t>0</w:t>
+      </w:r>
+      <w:proofErr w:type="gramEnd"/>
+      <w:r>
+        <w:rPr>
+          <w:rFonts w:ascii="Times New Roman" w:hAnsi="Times New Roman"/>
+          <w:color w:val="0F1115"/>
+          <w:sz w:val="24"/>
+        </w:rPr>
+        <w:t>% – все светодиоды включены</w:t>
       </w:r>
     </w:p>
     <w:p>
@@ -1423,6 +1458,18 @@
         </w:rPr>
         <w:t>а</w:t>
       </w:r>
+    </w:p>
+    <w:p>
+      <w:pPr>
+        <w:numPr>
+          <w:ilvl w:val="0"/>
+          <w:numId w:val="2"/>
+        </w:numPr>
+        <w:jc w:val="both"/>
+        <w:rPr>
+          <w:rFonts w:ascii="Times New Roman" w:hAnsi="Times New Roman"/>
+        </w:rPr>
+      </w:pPr>
     </w:p>
     <w:p>
       <w:pPr>
@@ -1730,6 +1777,12 @@
           <w:noProof/>
         </w:rPr>
         <w:lastRenderedPageBreak/>
+        <w:t>бэьджьдасмьджэбжэ</w:t>
+      </w:r>
+      <w:r>
+        <w:rPr>
+          <w:noProof/>
+        </w:rPr>
         <w:drawing>
           <wp:inline distT="0" distB="0" distL="0" distR="0" wp14:anchorId="456D416F" wp14:editId="46F12A92">
             <wp:extent cx="5943600" cy="6875145"/>
@@ -2836,36 +2889,76 @@
           <w:sz w:val="24"/>
           <w:lang w:val="en-US"/>
         </w:rPr>
-        <w:t>const uint8_t ledPins[] = {3, 4, 5};</w:t>
-      </w:r>
-    </w:p>
-    <w:p>
-      <w:pPr>
-        <w:rPr>
-          <w:rFonts w:ascii="Times New Roman" w:hAnsi="Times New Roman"/>
-          <w:color w:val="0F1115"/>
-          <w:sz w:val="24"/>
-          <w:lang w:val="en-US"/>
-        </w:rPr>
-      </w:pPr>
-    </w:p>
-    <w:p>
-      <w:pPr>
-        <w:rPr>
-          <w:rFonts w:ascii="Times New Roman" w:hAnsi="Times New Roman"/>
-          <w:color w:val="0F1115"/>
-          <w:sz w:val="24"/>
-          <w:lang w:val="en-US"/>
-        </w:rPr>
-      </w:pPr>
-      <w:r>
-        <w:rPr>
-          <w:rFonts w:ascii="Times New Roman" w:hAnsi="Times New Roman"/>
-          <w:color w:val="0F1115"/>
-          <w:sz w:val="24"/>
-          <w:lang w:val="en-US"/>
-        </w:rPr>
-        <w:t xml:space="preserve">void setup() </w:t>
+        <w:t xml:space="preserve">const uint8_t </w:t>
+      </w:r>
+      <w:proofErr w:type="gramStart"/>
+      <w:r>
+        <w:rPr>
+          <w:rFonts w:ascii="Times New Roman" w:hAnsi="Times New Roman"/>
+          <w:color w:val="0F1115"/>
+          <w:sz w:val="24"/>
+          <w:lang w:val="en-US"/>
+        </w:rPr>
+        <w:t>ledPins[</w:t>
+      </w:r>
+      <w:proofErr w:type="gramEnd"/>
+      <w:r>
+        <w:rPr>
+          <w:rFonts w:ascii="Times New Roman" w:hAnsi="Times New Roman"/>
+          <w:color w:val="0F1115"/>
+          <w:sz w:val="24"/>
+          <w:lang w:val="en-US"/>
+        </w:rPr>
+        <w:t>] = {3, 4, 5};</w:t>
+      </w:r>
+    </w:p>
+    <w:p>
+      <w:pPr>
+        <w:rPr>
+          <w:rFonts w:ascii="Times New Roman" w:hAnsi="Times New Roman"/>
+          <w:color w:val="0F1115"/>
+          <w:sz w:val="24"/>
+          <w:lang w:val="en-US"/>
+        </w:rPr>
+      </w:pPr>
+    </w:p>
+    <w:p>
+      <w:pPr>
+        <w:rPr>
+          <w:rFonts w:ascii="Times New Roman" w:hAnsi="Times New Roman"/>
+          <w:color w:val="0F1115"/>
+          <w:sz w:val="24"/>
+          <w:lang w:val="en-US"/>
+        </w:rPr>
+      </w:pPr>
+      <w:r>
+        <w:rPr>
+          <w:rFonts w:ascii="Times New Roman" w:hAnsi="Times New Roman"/>
+          <w:color w:val="0F1115"/>
+          <w:sz w:val="24"/>
+          <w:lang w:val="en-US"/>
+        </w:rPr>
+        <w:t xml:space="preserve">void </w:t>
+      </w:r>
+      <w:proofErr w:type="gramStart"/>
+      <w:r>
+        <w:rPr>
+          <w:rFonts w:ascii="Times New Roman" w:hAnsi="Times New Roman"/>
+          <w:color w:val="0F1115"/>
+          <w:sz w:val="24"/>
+          <w:lang w:val="en-US"/>
+        </w:rPr>
+        <w:t>setup(</w:t>
+      </w:r>
+      <w:proofErr w:type="gramEnd"/>
+      <w:r>
+        <w:rPr>
+          <w:rFonts w:ascii="Times New Roman" w:hAnsi="Times New Roman"/>
+          <w:color w:val="0F1115"/>
+          <w:sz w:val="24"/>
+          <w:lang w:val="en-US"/>
+        </w:rPr>
+        <w:t xml:space="preserve">) </w:t>
       </w:r>
     </w:p>
     <w:p>
@@ -3046,7 +3139,27 @@
           <w:sz w:val="24"/>
           <w:lang w:val="en-US"/>
         </w:rPr>
-        <w:t>void setIndicators(uint8_t count) {</w:t>
+        <w:t xml:space="preserve">void </w:t>
+      </w:r>
+      <w:proofErr w:type="gramStart"/>
+      <w:r>
+        <w:rPr>
+          <w:rFonts w:ascii="Times New Roman" w:hAnsi="Times New Roman"/>
+          <w:color w:val="0F1115"/>
+          <w:sz w:val="24"/>
+          <w:lang w:val="en-US"/>
+        </w:rPr>
+        <w:t>setIndicators(</w:t>
+      </w:r>
+      <w:proofErr w:type="gramEnd"/>
+      <w:r>
+        <w:rPr>
+          <w:rFonts w:ascii="Times New Roman" w:hAnsi="Times New Roman"/>
+          <w:color w:val="0F1115"/>
+          <w:sz w:val="24"/>
+          <w:lang w:val="en-US"/>
+        </w:rPr>
+        <w:t>uint8_t count) {</w:t>
       </w:r>
     </w:p>
     <w:p>
@@ -3084,7 +3197,47 @@
           <w:sz w:val="24"/>
           <w:lang w:val="en-US"/>
         </w:rPr>
-        <w:t xml:space="preserve">    digitalWrite(ledPins[i], i &lt; count ? HIGH : LOW);</w:t>
+        <w:t xml:space="preserve">    digitalWrite(ledPins[i], i &lt; </w:t>
+      </w:r>
+      <w:proofErr w:type="gramStart"/>
+      <w:r>
+        <w:rPr>
+          <w:rFonts w:ascii="Times New Roman" w:hAnsi="Times New Roman"/>
+          <w:color w:val="0F1115"/>
+          <w:sz w:val="24"/>
+          <w:lang w:val="en-US"/>
+        </w:rPr>
+        <w:t>count ?</w:t>
+      </w:r>
+      <w:proofErr w:type="gramEnd"/>
+      <w:r>
+        <w:rPr>
+          <w:rFonts w:ascii="Times New Roman" w:hAnsi="Times New Roman"/>
+          <w:color w:val="0F1115"/>
+          <w:sz w:val="24"/>
+          <w:lang w:val="en-US"/>
+        </w:rPr>
+        <w:t xml:space="preserve"> </w:t>
+      </w:r>
+      <w:proofErr w:type="gramStart"/>
+      <w:r>
+        <w:rPr>
+          <w:rFonts w:ascii="Times New Roman" w:hAnsi="Times New Roman"/>
+          <w:color w:val="0F1115"/>
+          <w:sz w:val="24"/>
+          <w:lang w:val="en-US"/>
+        </w:rPr>
+        <w:t>HIGH :</w:t>
+      </w:r>
+      <w:proofErr w:type="gramEnd"/>
+      <w:r>
+        <w:rPr>
+          <w:rFonts w:ascii="Times New Roman" w:hAnsi="Times New Roman"/>
+          <w:color w:val="0F1115"/>
+          <w:sz w:val="24"/>
+          <w:lang w:val="en-US"/>
+        </w:rPr>
+        <w:t xml:space="preserve"> LOW);</w:t>
       </w:r>
     </w:p>
     <w:p>
@@ -3151,45 +3304,105 @@
           <w:sz w:val="24"/>
           <w:lang w:val="en-US"/>
         </w:rPr>
-        <w:t>void loop() {</w:t>
-      </w:r>
-    </w:p>
-    <w:p>
-      <w:pPr>
-        <w:rPr>
-          <w:rFonts w:ascii="Times New Roman" w:hAnsi="Times New Roman"/>
-          <w:color w:val="0F1115"/>
-          <w:sz w:val="24"/>
-          <w:lang w:val="en-US"/>
-        </w:rPr>
-      </w:pPr>
-      <w:r>
-        <w:rPr>
-          <w:rFonts w:ascii="Times New Roman" w:hAnsi="Times New Roman"/>
-          <w:color w:val="0F1115"/>
-          <w:sz w:val="24"/>
-          <w:lang w:val="en-US"/>
-        </w:rPr>
-        <w:t xml:space="preserve">  int LightRead = analogRead(SensorPin);</w:t>
-      </w:r>
-    </w:p>
-    <w:p>
-      <w:pPr>
-        <w:rPr>
-          <w:rFonts w:ascii="Times New Roman" w:hAnsi="Times New Roman"/>
-          <w:color w:val="0F1115"/>
-          <w:sz w:val="24"/>
-          <w:lang w:val="en-US"/>
-        </w:rPr>
-      </w:pPr>
-      <w:r>
-        <w:rPr>
-          <w:rFonts w:ascii="Times New Roman" w:hAnsi="Times New Roman"/>
-          <w:color w:val="0F1115"/>
-          <w:sz w:val="24"/>
-          <w:lang w:val="en-US"/>
-        </w:rPr>
-        <w:t xml:space="preserve">  float luminocity = 100 - (LightRead/1015.0)*100.0;</w:t>
+        <w:t xml:space="preserve">void </w:t>
+      </w:r>
+      <w:proofErr w:type="gramStart"/>
+      <w:r>
+        <w:rPr>
+          <w:rFonts w:ascii="Times New Roman" w:hAnsi="Times New Roman"/>
+          <w:color w:val="0F1115"/>
+          <w:sz w:val="24"/>
+          <w:lang w:val="en-US"/>
+        </w:rPr>
+        <w:t>loop(</w:t>
+      </w:r>
+      <w:proofErr w:type="gramEnd"/>
+      <w:r>
+        <w:rPr>
+          <w:rFonts w:ascii="Times New Roman" w:hAnsi="Times New Roman"/>
+          <w:color w:val="0F1115"/>
+          <w:sz w:val="24"/>
+          <w:lang w:val="en-US"/>
+        </w:rPr>
+        <w:t>) {</w:t>
+      </w:r>
+    </w:p>
+    <w:p>
+      <w:pPr>
+        <w:rPr>
+          <w:rFonts w:ascii="Times New Roman" w:hAnsi="Times New Roman"/>
+          <w:color w:val="0F1115"/>
+          <w:sz w:val="24"/>
+          <w:lang w:val="en-US"/>
+        </w:rPr>
+      </w:pPr>
+      <w:r>
+        <w:rPr>
+          <w:rFonts w:ascii="Times New Roman" w:hAnsi="Times New Roman"/>
+          <w:color w:val="0F1115"/>
+          <w:sz w:val="24"/>
+          <w:lang w:val="en-US"/>
+        </w:rPr>
+        <w:t xml:space="preserve">  int LightRead = </w:t>
+      </w:r>
+      <w:proofErr w:type="gramStart"/>
+      <w:r>
+        <w:rPr>
+          <w:rFonts w:ascii="Times New Roman" w:hAnsi="Times New Roman"/>
+          <w:color w:val="0F1115"/>
+          <w:sz w:val="24"/>
+          <w:lang w:val="en-US"/>
+        </w:rPr>
+        <w:t>analogRead(</w:t>
+      </w:r>
+      <w:proofErr w:type="gramEnd"/>
+      <w:r>
+        <w:rPr>
+          <w:rFonts w:ascii="Times New Roman" w:hAnsi="Times New Roman"/>
+          <w:color w:val="0F1115"/>
+          <w:sz w:val="24"/>
+          <w:lang w:val="en-US"/>
+        </w:rPr>
+        <w:t>SensorPin);</w:t>
+      </w:r>
+    </w:p>
+    <w:p>
+      <w:pPr>
+        <w:rPr>
+          <w:rFonts w:ascii="Times New Roman" w:hAnsi="Times New Roman"/>
+          <w:color w:val="0F1115"/>
+          <w:sz w:val="24"/>
+          <w:lang w:val="en-US"/>
+        </w:rPr>
+      </w:pPr>
+      <w:r>
+        <w:rPr>
+          <w:rFonts w:ascii="Times New Roman" w:hAnsi="Times New Roman"/>
+          <w:color w:val="0F1115"/>
+          <w:sz w:val="24"/>
+          <w:lang w:val="en-US"/>
+        </w:rPr>
+        <w:t xml:space="preserve">  float luminocity = 100 - (LightRead/1015.</w:t>
+      </w:r>
+      <w:proofErr w:type="gramStart"/>
+      <w:r>
+        <w:rPr>
+          <w:rFonts w:ascii="Times New Roman" w:hAnsi="Times New Roman"/>
+          <w:color w:val="0F1115"/>
+          <w:sz w:val="24"/>
+          <w:lang w:val="en-US"/>
+        </w:rPr>
+        <w:t>0)*</w:t>
+      </w:r>
+      <w:proofErr w:type="gramEnd"/>
+      <w:r>
+        <w:rPr>
+          <w:rFonts w:ascii="Times New Roman" w:hAnsi="Times New Roman"/>
+          <w:color w:val="0F1115"/>
+          <w:sz w:val="24"/>
+          <w:lang w:val="en-US"/>
+        </w:rPr>
+        <w:t>100.0;</w:t>
       </w:r>
     </w:p>
     <w:p>
@@ -3313,7 +3526,27 @@
           <w:sz w:val="24"/>
           <w:lang w:val="en-US"/>
         </w:rPr>
-        <w:t xml:space="preserve">  if      (luminocity &lt; DARK)   </w:t>
+        <w:t xml:space="preserve">  if   </w:t>
+      </w:r>
+      <w:proofErr w:type="gramStart"/>
+      <w:r>
+        <w:rPr>
+          <w:rFonts w:ascii="Times New Roman" w:hAnsi="Times New Roman"/>
+          <w:color w:val="0F1115"/>
+          <w:sz w:val="24"/>
+          <w:lang w:val="en-US"/>
+        </w:rPr>
+        <w:t xml:space="preserve">   (</w:t>
+      </w:r>
+      <w:proofErr w:type="gramEnd"/>
+      <w:r>
+        <w:rPr>
+          <w:rFonts w:ascii="Times New Roman" w:hAnsi="Times New Roman"/>
+          <w:color w:val="0F1115"/>
+          <w:sz w:val="24"/>
+          <w:lang w:val="en-US"/>
+        </w:rPr>
+        <w:t xml:space="preserve">luminocity &lt; DARK)   </w:t>
       </w:r>
     </w:p>
     <w:p>
@@ -3507,6 +3740,7 @@
         <w:t xml:space="preserve">  </w:t>
       </w:r>
       <w:proofErr w:type="spellStart"/>
+      <w:proofErr w:type="gramStart"/>
       <w:r>
         <w:rPr>
           <w:rFonts w:ascii="Times New Roman" w:hAnsi="Times New Roman"/>
@@ -3522,7 +3756,16 @@
           <w:color w:val="0F1115"/>
           <w:sz w:val="24"/>
         </w:rPr>
-        <w:t>(400);</w:t>
+        <w:t>(</w:t>
+      </w:r>
+      <w:proofErr w:type="gramEnd"/>
+      <w:r>
+        <w:rPr>
+          <w:rFonts w:ascii="Times New Roman" w:hAnsi="Times New Roman"/>
+          <w:color w:val="0F1115"/>
+          <w:sz w:val="24"/>
+        </w:rPr>
+        <w:t>400);</w:t>
       </w:r>
     </w:p>
     <w:p>

</xml_diff>